<commit_message>
Adding Pytest with Playwright notes
</commit_message>
<xml_diff>
--- a/Playwright/Tests-01/Playwright-Notes-02.docx
+++ b/Playwright/Tests-01/Playwright-Notes-02.docx
@@ -44,7 +44,23 @@
           <w:sz w:val="28"/>
           <w:szCs w:val="28"/>
         </w:rPr>
-        <w:t>Then for pytest.ini:</w:t>
+        <w:t>Then</w:t>
+      </w:r>
+      <w:r>
+        <w:rPr>
+          <w:rFonts w:ascii="Sakkal Majalla" w:hAnsi="Sakkal Majalla" w:cs="Sakkal Majalla"/>
+          <w:sz w:val="28"/>
+          <w:szCs w:val="28"/>
+        </w:rPr>
+        <w:t>,</w:t>
+      </w:r>
+      <w:r>
+        <w:rPr>
+          <w:rFonts w:ascii="Sakkal Majalla" w:hAnsi="Sakkal Majalla" w:cs="Sakkal Majalla"/>
+          <w:sz w:val="28"/>
+          <w:szCs w:val="28"/>
+        </w:rPr>
+        <w:t xml:space="preserve"> for pytest.ini:</w:t>
       </w:r>
     </w:p>
     <w:p>
@@ -79,7 +95,6 @@
           <w:szCs w:val="21"/>
         </w:rPr>
       </w:pPr>
-      <w:proofErr w:type="spellStart"/>
       <w:r>
         <w:rPr>
           <w:rFonts w:ascii="Consolas" w:eastAsia="Times New Roman" w:hAnsi="Consolas" w:cs="Times New Roman"/>
@@ -89,7 +104,6 @@
         </w:rPr>
         <w:t>addopts</w:t>
       </w:r>
-      <w:proofErr w:type="spellEnd"/>
       <w:r>
         <w:rPr>
           <w:rFonts w:ascii="Consolas" w:eastAsia="Times New Roman" w:hAnsi="Consolas" w:cs="Times New Roman"/>
@@ -99,7 +113,6 @@
         </w:rPr>
         <w:t xml:space="preserve"> = --headed --</w:t>
       </w:r>
-      <w:proofErr w:type="spellStart"/>
       <w:r>
         <w:rPr>
           <w:rFonts w:ascii="Consolas" w:eastAsia="Times New Roman" w:hAnsi="Consolas" w:cs="Times New Roman"/>
@@ -109,7 +122,6 @@
         </w:rPr>
         <w:t>slowmo</w:t>
       </w:r>
-      <w:proofErr w:type="spellEnd"/>
       <w:r>
         <w:rPr>
           <w:rFonts w:ascii="Consolas" w:eastAsia="Times New Roman" w:hAnsi="Consolas" w:cs="Times New Roman"/>
@@ -168,15 +180,39 @@
           <w:sz w:val="28"/>
           <w:szCs w:val="28"/>
         </w:rPr>
-        <w:t>For test case</w:t>
-      </w:r>
-      <w:r>
-        <w:rPr>
-          <w:rFonts w:ascii="Sakkal Majalla" w:hAnsi="Sakkal Majalla" w:cs="Sakkal Majalla"/>
-          <w:sz w:val="28"/>
-          <w:szCs w:val="28"/>
-        </w:rPr>
-        <w:t xml:space="preserve"> and take screenshots &amp; video</w:t>
+        <w:t xml:space="preserve">For test </w:t>
+      </w:r>
+      <w:r>
+        <w:rPr>
+          <w:rFonts w:ascii="Sakkal Majalla" w:hAnsi="Sakkal Majalla" w:cs="Sakkal Majalla"/>
+          <w:sz w:val="28"/>
+          <w:szCs w:val="28"/>
+        </w:rPr>
+        <w:t>cases</w:t>
+      </w:r>
+      <w:r>
+        <w:rPr>
+          <w:rFonts w:ascii="Sakkal Majalla" w:hAnsi="Sakkal Majalla" w:cs="Sakkal Majalla"/>
+          <w:sz w:val="28"/>
+          <w:szCs w:val="28"/>
+        </w:rPr>
+        <w:t xml:space="preserve"> and </w:t>
+      </w:r>
+      <w:r>
+        <w:rPr>
+          <w:rFonts w:ascii="Sakkal Majalla" w:hAnsi="Sakkal Majalla" w:cs="Sakkal Majalla"/>
+          <w:sz w:val="28"/>
+          <w:szCs w:val="28"/>
+        </w:rPr>
+        <w:t xml:space="preserve">to </w:t>
+      </w:r>
+      <w:r>
+        <w:rPr>
+          <w:rFonts w:ascii="Sakkal Majalla" w:hAnsi="Sakkal Majalla" w:cs="Sakkal Majalla"/>
+          <w:sz w:val="28"/>
+          <w:szCs w:val="28"/>
+        </w:rPr>
+        <w:t>take screenshots &amp; video</w:t>
       </w:r>
       <w:r>
         <w:rPr>
@@ -505,7 +541,7 @@
       <w:r>
         <w:rPr>
           <w:rFonts w:ascii="Consolas" w:eastAsia="Times New Roman" w:hAnsi="Consolas" w:cs="Times New Roman"/>
-          <w:color w:val="3B3B3B"/>
+          <w:color w:val="001080"/>
           <w:sz w:val="21"/>
           <w:szCs w:val="21"/>
         </w:rPr>
@@ -4139,7 +4175,23 @@
           <w:sz w:val="28"/>
           <w:szCs w:val="28"/>
         </w:rPr>
-        <w:t>To use playwright assertions:</w:t>
+        <w:t xml:space="preserve">To use </w:t>
+      </w:r>
+      <w:r>
+        <w:rPr>
+          <w:rFonts w:ascii="Sakkal Majalla" w:hAnsi="Sakkal Majalla" w:cs="Sakkal Majalla"/>
+          <w:sz w:val="28"/>
+          <w:szCs w:val="28"/>
+        </w:rPr>
+        <w:t>Playwright</w:t>
+      </w:r>
+      <w:r>
+        <w:rPr>
+          <w:rFonts w:ascii="Sakkal Majalla" w:hAnsi="Sakkal Majalla" w:cs="Sakkal Majalla"/>
+          <w:sz w:val="28"/>
+          <w:szCs w:val="28"/>
+        </w:rPr>
+        <w:t xml:space="preserve"> assertions:</w:t>
       </w:r>
     </w:p>
     <w:p>
@@ -5232,8 +5284,52 @@
       <w:pPr>
         <w:rPr>
           <w:rFonts w:ascii="Sakkal Majalla" w:hAnsi="Sakkal Majalla" w:cs="Sakkal Majalla"/>
-          <w:sz w:val="28"/>
-          <w:szCs w:val="28"/>
+          <w:sz w:val="24"/>
+          <w:szCs w:val="24"/>
+        </w:rPr>
+      </w:pPr>
+      <w:r>
+        <w:rPr>
+          <w:rFonts w:ascii="Sakkal Majalla" w:hAnsi="Sakkal Majalla" w:cs="Sakkal Majalla" w:hint="cs"/>
+          <w:color w:val="538135" w:themeColor="accent6" w:themeShade="BF"/>
+          <w:sz w:val="24"/>
+          <w:szCs w:val="24"/>
+        </w:rPr>
+        <w:t>Note</w:t>
+      </w:r>
+      <w:r>
+        <w:rPr>
+          <w:rFonts w:ascii="Sakkal Majalla" w:hAnsi="Sakkal Majalla" w:cs="Sakkal Majalla" w:hint="cs"/>
+          <w:sz w:val="24"/>
+          <w:szCs w:val="24"/>
+        </w:rPr>
+        <w:t>: The locator method has a screenshot method.</w:t>
+      </w:r>
+    </w:p>
+    <w:p>
+      <w:pPr>
+        <w:ind w:left="720" w:firstLine="720"/>
+        <w:rPr>
+          <w:rFonts w:ascii="Sakkal Majalla" w:hAnsi="Sakkal Majalla" w:cs="Sakkal Majalla"/>
+          <w:sz w:val="28"/>
+          <w:szCs w:val="28"/>
+        </w:rPr>
+      </w:pPr>
+      <w:r>
+        <w:rPr>
+          <w:rFonts w:ascii="Sakkal Majalla" w:hAnsi="Sakkal Majalla" w:cs="Sakkal Majalla"/>
+          <w:sz w:val="28"/>
+          <w:szCs w:val="28"/>
+        </w:rPr>
+        <w:t>************************************************************************</w:t>
+      </w:r>
+    </w:p>
+    <w:p>
+      <w:pPr>
+        <w:rPr>
+          <w:rFonts w:ascii="Sakkal Majalla" w:hAnsi="Sakkal Majalla" w:cs="Sakkal Majalla" w:hint="cs"/>
+          <w:sz w:val="24"/>
+          <w:szCs w:val="24"/>
         </w:rPr>
       </w:pPr>
     </w:p>
@@ -5252,8 +5348,8 @@
   <w:abstractNum w:abstractNumId="0" w15:restartNumberingAfterBreak="0">
     <w:nsid w:val="1E990631"/>
     <w:multiLevelType w:val="hybridMultilevel"/>
-    <w:tmpl w:val="DD28D4EC"/>
-    <w:lvl w:ilvl="0" w:tplc="8D3CC938">
+    <w:tmpl w:val="CA76A4EC"/>
+    <w:lvl w:ilvl="0" w:tplc="97AABCEA">
       <w:numFmt w:val="bullet"/>
       <w:lvlText w:val=""/>
       <w:lvlJc w:val="left"/>
@@ -5262,6 +5358,7 @@
       </w:pPr>
       <w:rPr>
         <w:rFonts w:ascii="Symbol" w:eastAsiaTheme="minorHAnsi" w:hAnsi="Symbol" w:cs="Sakkal Majalla" w:hint="default"/>
+        <w:color w:val="auto"/>
       </w:rPr>
     </w:lvl>
     <w:lvl w:ilvl="1" w:tplc="04090003" w:tentative="1">

</xml_diff>